<commit_message>
Docs: Clean up Word (.doc / .docx) formatting to formal academic text style without raw emoji symbols
</commit_message>
<xml_diff>
--- a/hotel-booking-app/DATN_VnStay_BaoCaoQuanLyDuAn.docx
+++ b/hotel-booking-app/DATN_VnStay_BaoCaoQuanLyDuAn.docx
@@ -16,7 +16,7 @@
         <w:br/>
         <w:t>TRƯỜNG ĐẠI HỌC / HỌC VIỆN CÔNG NGHỆ THÔNG TIN</w:t>
         <w:br/>
-        <w:t>KHOA CÔNG NGHỆ THÔNG TIN</w:t>
+        <w:t>KHOA CÔNG NGHỆ THÔNG TIN - BỘ MÔN PHẦN MỀM</w:t>
         <w:br/>
       </w:r>
     </w:p>
@@ -54,7 +54,7 @@
         <w:rPr>
           <w:b/>
           <w:color w:val="0284C7"/>
-          <w:sz w:val="30"/>
+          <w:sz w:val="28"/>
         </w:rPr>
         <w:t>ĐỀ TÀI: XÂY DỰNG HỆ THỐNG WEBSITE ĐẶT PHÒNG KHÁCH SẠN VÀ RESORT TRỰC TUYẾN TOÀN QUỐC (VNSTAY.VN)</w:t>
         <w:br/>
@@ -212,7 +212,7 @@
         <w:br/>
       </w:r>
       <w:r>
-        <w:t>Nhu cầu du lịch và đặt phòng trực tuyến tại Việt Nam gia tăng nhanh chóng. Khách hàng đòi hỏi nền tảng đặt phòng phải minh bạch chi phí (đã bao gồm Thuế &amp; Phí), thao tác tìm kiếm mượt mà theo 63 tỉnh thành, nhận mã E-Voucher QR Code tức thì và tuyệt đối an toàn thông tin cá nhân.</w:t>
+        <w:t>Nhu cầu du lịch và đặt phòng trực tuyến tại Việt Nam gia tăng nhanh chóng. Khách hàng đòi hỏi nền tảng đặt phòng phải minh bạch chi phí (đã bao gồm Thuế VAT &amp; Phí dịch vụ), thao tác tìm kiếm mượt mà theo 63 tỉnh thành, nhận mã E-Voucher QR Code tức thì và tuyệt đối an toàn thông tin cá nhân.</w:t>
         <w:br/>
         <w:br/>
       </w:r>
@@ -228,7 +228,7 @@
         <w:br/>
       </w:r>
       <w:r>
-        <w:t>• Phía Quản Trị Viên (Admin): Dashboard thống kê doanh thu real-time, đặt phòng trực tiếp tại quầy (Walk-in), theo dõi trạng thái 🟢 Phòng Trống / 🔴 Đã Thuê, quản lý Mã KH (`usr_...`) và xuất báo cáo CSV/Excel.</w:t>
+        <w:t>• Phía Quản Trị Viên (Admin): Dashboard thống kê doanh thu real-time, đặt phòng trực tiếp tại quầy (Walk-in), theo dõi trạng thái Phòng Trống / Đã Thuê, quản lý Mã KH (usr_...) và xuất báo cáo CSV/Excel.</w:t>
         <w:br/>
         <w:br/>
       </w:r>
@@ -257,8 +257,8 @@
             <w:tcW w:type="dxa" w:w="3120"/>
             <w:shd w:fill="003580"/>
             <w:tcMar>
-              <w:top w:w="120" w:type="dxa"/>
-              <w:bottom w:w="120" w:type="dxa"/>
+              <w:top w:w="140" w:type="dxa"/>
+              <w:bottom w:w="140" w:type="dxa"/>
               <w:left w:w="150" w:type="dxa"/>
               <w:right w:w="150" w:type="dxa"/>
             </w:tcMar>
@@ -283,8 +283,8 @@
             <w:tcW w:type="dxa" w:w="3120"/>
             <w:shd w:fill="003580"/>
             <w:tcMar>
-              <w:top w:w="120" w:type="dxa"/>
-              <w:bottom w:w="120" w:type="dxa"/>
+              <w:top w:w="140" w:type="dxa"/>
+              <w:bottom w:w="140" w:type="dxa"/>
               <w:left w:w="150" w:type="dxa"/>
               <w:right w:w="150" w:type="dxa"/>
             </w:tcMar>
@@ -309,8 +309,8 @@
             <w:tcW w:type="dxa" w:w="3120"/>
             <w:shd w:fill="003580"/>
             <w:tcMar>
-              <w:top w:w="120" w:type="dxa"/>
-              <w:bottom w:w="120" w:type="dxa"/>
+              <w:top w:w="140" w:type="dxa"/>
+              <w:bottom w:w="140" w:type="dxa"/>
               <w:left w:w="150" w:type="dxa"/>
               <w:right w:w="150" w:type="dxa"/>
             </w:tcMar>
@@ -951,8 +951,8 @@
             <w:tcW w:type="dxa" w:w="1560"/>
             <w:shd w:fill="003580"/>
             <w:tcMar>
-              <w:top w:w="120" w:type="dxa"/>
-              <w:bottom w:w="120" w:type="dxa"/>
+              <w:top w:w="140" w:type="dxa"/>
+              <w:bottom w:w="140" w:type="dxa"/>
               <w:left w:w="150" w:type="dxa"/>
               <w:right w:w="150" w:type="dxa"/>
             </w:tcMar>
@@ -977,8 +977,8 @@
             <w:tcW w:type="dxa" w:w="1560"/>
             <w:shd w:fill="003580"/>
             <w:tcMar>
-              <w:top w:w="120" w:type="dxa"/>
-              <w:bottom w:w="120" w:type="dxa"/>
+              <w:top w:w="140" w:type="dxa"/>
+              <w:bottom w:w="140" w:type="dxa"/>
               <w:left w:w="150" w:type="dxa"/>
               <w:right w:w="150" w:type="dxa"/>
             </w:tcMar>
@@ -1003,8 +1003,8 @@
             <w:tcW w:type="dxa" w:w="1560"/>
             <w:shd w:fill="003580"/>
             <w:tcMar>
-              <w:top w:w="120" w:type="dxa"/>
-              <w:bottom w:w="120" w:type="dxa"/>
+              <w:top w:w="140" w:type="dxa"/>
+              <w:bottom w:w="140" w:type="dxa"/>
               <w:left w:w="150" w:type="dxa"/>
               <w:right w:w="150" w:type="dxa"/>
             </w:tcMar>
@@ -1029,8 +1029,8 @@
             <w:tcW w:type="dxa" w:w="1560"/>
             <w:shd w:fill="003580"/>
             <w:tcMar>
-              <w:top w:w="120" w:type="dxa"/>
-              <w:bottom w:w="120" w:type="dxa"/>
+              <w:top w:w="140" w:type="dxa"/>
+              <w:bottom w:w="140" w:type="dxa"/>
               <w:left w:w="150" w:type="dxa"/>
               <w:right w:w="150" w:type="dxa"/>
             </w:tcMar>
@@ -1055,8 +1055,8 @@
             <w:tcW w:type="dxa" w:w="1560"/>
             <w:shd w:fill="003580"/>
             <w:tcMar>
-              <w:top w:w="120" w:type="dxa"/>
-              <w:bottom w:w="120" w:type="dxa"/>
+              <w:top w:w="140" w:type="dxa"/>
+              <w:bottom w:w="140" w:type="dxa"/>
               <w:left w:w="150" w:type="dxa"/>
               <w:right w:w="150" w:type="dxa"/>
             </w:tcMar>
@@ -1081,8 +1081,8 @@
             <w:tcW w:type="dxa" w:w="1560"/>
             <w:shd w:fill="003580"/>
             <w:tcMar>
-              <w:top w:w="120" w:type="dxa"/>
-              <w:bottom w:w="120" w:type="dxa"/>
+              <w:top w:w="140" w:type="dxa"/>
+              <w:bottom w:w="140" w:type="dxa"/>
               <w:left w:w="150" w:type="dxa"/>
               <w:right w:w="150" w:type="dxa"/>
             </w:tcMar>
@@ -1226,7 +1226,7 @@
                 <w:rFonts w:ascii="Times New Roman" w:hAnsi="Times New Roman"/>
                 <w:sz w:val="20"/>
               </w:rPr>
-              <w:t>🟢 PASS 100%</w:t>
+              <w:t>ĐẠI (100%)</w:t>
             </w:r>
           </w:p>
         </w:tc>
@@ -1352,9 +1352,11 @@
             <w:r>
               <w:rPr>
                 <w:rFonts w:ascii="Times New Roman" w:hAnsi="Times New Roman"/>
+                <w:b/>
+                <w:color w:val="166534"/>
                 <w:sz w:val="20"/>
               </w:rPr>
-              <w:t>🟢 PASS 100%</w:t>
+              <w:t>ĐẠT (100%)</w:t>
             </w:r>
           </w:p>
         </w:tc>
@@ -1480,9 +1482,11 @@
             <w:r>
               <w:rPr>
                 <w:rFonts w:ascii="Times New Roman" w:hAnsi="Times New Roman"/>
+                <w:b/>
+                <w:color w:val="166534"/>
                 <w:sz w:val="20"/>
               </w:rPr>
-              <w:t>🟢 PASS 100%</w:t>
+              <w:t>ĐẠT (100%)</w:t>
             </w:r>
           </w:p>
         </w:tc>
@@ -1608,9 +1612,11 @@
             <w:r>
               <w:rPr>
                 <w:rFonts w:ascii="Times New Roman" w:hAnsi="Times New Roman"/>
+                <w:b/>
+                <w:color w:val="166534"/>
                 <w:sz w:val="20"/>
               </w:rPr>
-              <w:t>🟢 PASS 100%</w:t>
+              <w:t>ĐẠT (100%)</w:t>
             </w:r>
           </w:p>
         </w:tc>
@@ -1736,9 +1742,11 @@
             <w:r>
               <w:rPr>
                 <w:rFonts w:ascii="Times New Roman" w:hAnsi="Times New Roman"/>
+                <w:b/>
+                <w:color w:val="166534"/>
                 <w:sz w:val="20"/>
               </w:rPr>
-              <w:t>🟢 PASS 100%</w:t>
+              <w:t>ĐẠT (100%)</w:t>
             </w:r>
           </w:p>
         </w:tc>
@@ -1864,9 +1872,11 @@
             <w:r>
               <w:rPr>
                 <w:rFonts w:ascii="Times New Roman" w:hAnsi="Times New Roman"/>
+                <w:b/>
+                <w:color w:val="166534"/>
                 <w:sz w:val="20"/>
               </w:rPr>
-              <w:t>🟢 PASS 100%</w:t>
+              <w:t>ĐẠT (100%)</w:t>
             </w:r>
           </w:p>
         </w:tc>
@@ -1992,9 +2002,11 @@
             <w:r>
               <w:rPr>
                 <w:rFonts w:ascii="Times New Roman" w:hAnsi="Times New Roman"/>
+                <w:b/>
+                <w:color w:val="166534"/>
                 <w:sz w:val="20"/>
               </w:rPr>
-              <w:t>🟢 PASS 100%</w:t>
+              <w:t>ĐẠT (100%)</w:t>
             </w:r>
           </w:p>
         </w:tc>
@@ -2120,9 +2132,11 @@
             <w:r>
               <w:rPr>
                 <w:rFonts w:ascii="Times New Roman" w:hAnsi="Times New Roman"/>
+                <w:b/>
+                <w:color w:val="166534"/>
                 <w:sz w:val="20"/>
               </w:rPr>
-              <w:t>🟢 PASS 100%</w:t>
+              <w:t>ĐẠT (100%)</w:t>
             </w:r>
           </w:p>
         </w:tc>
@@ -2248,9 +2262,11 @@
             <w:r>
               <w:rPr>
                 <w:rFonts w:ascii="Times New Roman" w:hAnsi="Times New Roman"/>
+                <w:b/>
+                <w:color w:val="166534"/>
                 <w:sz w:val="20"/>
               </w:rPr>
-              <w:t>🟢 PASS 100%</w:t>
+              <w:t>ĐẠT (100%)</w:t>
             </w:r>
           </w:p>
         </w:tc>
@@ -2376,9 +2392,11 @@
             <w:r>
               <w:rPr>
                 <w:rFonts w:ascii="Times New Roman" w:hAnsi="Times New Roman"/>
+                <w:b/>
+                <w:color w:val="166534"/>
                 <w:sz w:val="20"/>
               </w:rPr>
-              <w:t>🟢 PASS 100%</w:t>
+              <w:t>ĐẠT (100%)</w:t>
             </w:r>
           </w:p>
         </w:tc>
@@ -2504,9 +2522,11 @@
             <w:r>
               <w:rPr>
                 <w:rFonts w:ascii="Times New Roman" w:hAnsi="Times New Roman"/>
+                <w:b/>
+                <w:color w:val="166534"/>
                 <w:sz w:val="20"/>
               </w:rPr>
-              <w:t>🟢 PASS 100%</w:t>
+              <w:t>ĐẠT (100%)</w:t>
             </w:r>
           </w:p>
         </w:tc>
@@ -2632,9 +2652,11 @@
             <w:r>
               <w:rPr>
                 <w:rFonts w:ascii="Times New Roman" w:hAnsi="Times New Roman"/>
+                <w:b/>
+                <w:color w:val="166534"/>
                 <w:sz w:val="20"/>
               </w:rPr>
-              <w:t>🟢 PASS 100%</w:t>
+              <w:t>ĐẠT (100%)</w:t>
             </w:r>
           </w:p>
         </w:tc>
@@ -2760,9 +2782,11 @@
             <w:r>
               <w:rPr>
                 <w:rFonts w:ascii="Times New Roman" w:hAnsi="Times New Roman"/>
+                <w:b/>
+                <w:color w:val="166534"/>
                 <w:sz w:val="20"/>
               </w:rPr>
-              <w:t>🟢 PASS 100%</w:t>
+              <w:t>ĐẠT (100%)</w:t>
             </w:r>
           </w:p>
         </w:tc>
@@ -2888,9 +2912,11 @@
             <w:r>
               <w:rPr>
                 <w:rFonts w:ascii="Times New Roman" w:hAnsi="Times New Roman"/>
+                <w:b/>
+                <w:color w:val="166534"/>
                 <w:sz w:val="20"/>
               </w:rPr>
-              <w:t>🟢 PASS 100%</w:t>
+              <w:t>ĐẠT (100%)</w:t>
             </w:r>
           </w:p>
         </w:tc>
@@ -3016,9 +3042,11 @@
             <w:r>
               <w:rPr>
                 <w:rFonts w:ascii="Times New Roman" w:hAnsi="Times New Roman"/>
+                <w:b/>
+                <w:color w:val="166534"/>
                 <w:sz w:val="20"/>
               </w:rPr>
-              <w:t>🟢 PASS 100%</w:t>
+              <w:t>ĐẠT (100%)</w:t>
             </w:r>
           </w:p>
         </w:tc>
@@ -3144,9 +3172,11 @@
             <w:r>
               <w:rPr>
                 <w:rFonts w:ascii="Times New Roman" w:hAnsi="Times New Roman"/>
+                <w:b/>
+                <w:color w:val="166534"/>
                 <w:sz w:val="20"/>
               </w:rPr>
-              <w:t>🟢 PASS 100%</w:t>
+              <w:t>ĐẠT (100%)</w:t>
             </w:r>
           </w:p>
         </w:tc>
@@ -3272,9 +3302,11 @@
             <w:r>
               <w:rPr>
                 <w:rFonts w:ascii="Times New Roman" w:hAnsi="Times New Roman"/>
+                <w:b/>
+                <w:color w:val="166534"/>
                 <w:sz w:val="20"/>
               </w:rPr>
-              <w:t>🟢 PASS 100%</w:t>
+              <w:t>ĐẠT (100%)</w:t>
             </w:r>
           </w:p>
         </w:tc>
@@ -3400,9 +3432,11 @@
             <w:r>
               <w:rPr>
                 <w:rFonts w:ascii="Times New Roman" w:hAnsi="Times New Roman"/>
+                <w:b/>
+                <w:color w:val="166534"/>
                 <w:sz w:val="20"/>
               </w:rPr>
-              <w:t>🟢 PASS 100%</w:t>
+              <w:t>ĐẠT (100%)</w:t>
             </w:r>
           </w:p>
         </w:tc>
@@ -3453,8 +3487,8 @@
             <w:tcW w:type="dxa" w:w="3120"/>
             <w:shd w:fill="003580"/>
             <w:tcMar>
-              <w:top w:w="120" w:type="dxa"/>
-              <w:bottom w:w="120" w:type="dxa"/>
+              <w:top w:w="140" w:type="dxa"/>
+              <w:bottom w:w="140" w:type="dxa"/>
               <w:left w:w="150" w:type="dxa"/>
               <w:right w:w="150" w:type="dxa"/>
             </w:tcMar>
@@ -3479,8 +3513,8 @@
             <w:tcW w:type="dxa" w:w="3120"/>
             <w:shd w:fill="003580"/>
             <w:tcMar>
-              <w:top w:w="120" w:type="dxa"/>
-              <w:bottom w:w="120" w:type="dxa"/>
+              <w:top w:w="140" w:type="dxa"/>
+              <w:bottom w:w="140" w:type="dxa"/>
               <w:left w:w="150" w:type="dxa"/>
               <w:right w:w="150" w:type="dxa"/>
             </w:tcMar>
@@ -3505,8 +3539,8 @@
             <w:tcW w:type="dxa" w:w="3120"/>
             <w:shd w:fill="003580"/>
             <w:tcMar>
-              <w:top w:w="120" w:type="dxa"/>
-              <w:bottom w:w="120" w:type="dxa"/>
+              <w:top w:w="140" w:type="dxa"/>
+              <w:bottom w:w="140" w:type="dxa"/>
               <w:left w:w="150" w:type="dxa"/>
               <w:right w:w="150" w:type="dxa"/>
             </w:tcMar>
@@ -4014,8 +4048,8 @@
             <w:tcW w:type="dxa" w:w="3120"/>
             <w:shd w:fill="003580"/>
             <w:tcMar>
-              <w:top w:w="120" w:type="dxa"/>
-              <w:bottom w:w="120" w:type="dxa"/>
+              <w:top w:w="140" w:type="dxa"/>
+              <w:bottom w:w="140" w:type="dxa"/>
               <w:left w:w="150" w:type="dxa"/>
               <w:right w:w="150" w:type="dxa"/>
             </w:tcMar>
@@ -4040,8 +4074,8 @@
             <w:tcW w:type="dxa" w:w="3120"/>
             <w:shd w:fill="003580"/>
             <w:tcMar>
-              <w:top w:w="120" w:type="dxa"/>
-              <w:bottom w:w="120" w:type="dxa"/>
+              <w:top w:w="140" w:type="dxa"/>
+              <w:bottom w:w="140" w:type="dxa"/>
               <w:left w:w="150" w:type="dxa"/>
               <w:right w:w="150" w:type="dxa"/>
             </w:tcMar>
@@ -4066,8 +4100,8 @@
             <w:tcW w:type="dxa" w:w="3120"/>
             <w:shd w:fill="003580"/>
             <w:tcMar>
-              <w:top w:w="120" w:type="dxa"/>
-              <w:bottom w:w="120" w:type="dxa"/>
+              <w:top w:w="140" w:type="dxa"/>
+              <w:bottom w:w="140" w:type="dxa"/>
               <w:left w:w="150" w:type="dxa"/>
               <w:right w:w="150" w:type="dxa"/>
             </w:tcMar>
@@ -4278,7 +4312,7 @@
                 <w:rFonts w:ascii="Times New Roman" w:hAnsi="Times New Roman"/>
                 <w:sz w:val="20"/>
               </w:rPr>
-              <w:t>Phân loại 🟢 Phòng Trống vs 🔴 Đã Thuê (Hiển thị Tên khách, SĐT &amp; thời gian ở).</w:t>
+              <w:t>Phân loại Phòng Trống vs Đã Thuê (Hiển thị Tên khách, SĐT &amp; thời gian ở).</w:t>
             </w:r>
           </w:p>
         </w:tc>
@@ -4408,7 +4442,7 @@
                 <w:rFonts w:ascii="Times New Roman" w:hAnsi="Times New Roman"/>
                 <w:sz w:val="20"/>
               </w:rPr>
-              <w:t>Tra cứu Mã KH (`usr_...`), tổng chi tiêu tích lũy &amp; danh sách phòng từng khách đã thuê.</w:t>
+              <w:t>Tra cứu Mã KH (usr_...), tổng chi tiêu tích lũy &amp; danh sách phòng từng khách đã thuê.</w:t>
             </w:r>
           </w:p>
         </w:tc>
@@ -4589,8 +4623,8 @@
             <w:tcW w:type="dxa" w:w="3120"/>
             <w:shd w:fill="003580"/>
             <w:tcMar>
-              <w:top w:w="120" w:type="dxa"/>
-              <w:bottom w:w="120" w:type="dxa"/>
+              <w:top w:w="140" w:type="dxa"/>
+              <w:bottom w:w="140" w:type="dxa"/>
               <w:left w:w="150" w:type="dxa"/>
               <w:right w:w="150" w:type="dxa"/>
             </w:tcMar>
@@ -4615,8 +4649,8 @@
             <w:tcW w:type="dxa" w:w="3120"/>
             <w:shd w:fill="003580"/>
             <w:tcMar>
-              <w:top w:w="120" w:type="dxa"/>
-              <w:bottom w:w="120" w:type="dxa"/>
+              <w:top w:w="140" w:type="dxa"/>
+              <w:bottom w:w="140" w:type="dxa"/>
               <w:left w:w="150" w:type="dxa"/>
               <w:right w:w="150" w:type="dxa"/>
             </w:tcMar>
@@ -4641,8 +4675,8 @@
             <w:tcW w:type="dxa" w:w="3120"/>
             <w:shd w:fill="003580"/>
             <w:tcMar>
-              <w:top w:w="120" w:type="dxa"/>
-              <w:bottom w:w="120" w:type="dxa"/>
+              <w:top w:w="140" w:type="dxa"/>
+              <w:bottom w:w="140" w:type="dxa"/>
               <w:left w:w="150" w:type="dxa"/>
               <w:right w:w="150" w:type="dxa"/>
             </w:tcMar>
@@ -5048,7 +5082,7 @@
                 <w:rFonts w:ascii="Times New Roman" w:hAnsi="Times New Roman"/>
                 <w:sz w:val="20"/>
               </w:rPr>
-              <w:t>Lưu bình luận &amp; điểm sao đánh giá ($1 \rightarrow 5$ sao) cho từng phòng</w:t>
+              <w:t>Lưu bình luận &amp; điểm sao đánh giá (1 -&gt; 5 sao) cho từng phòng</w:t>
             </w:r>
           </w:p>
         </w:tc>
@@ -5086,8 +5120,8 @@
             <w:tcW w:type="dxa" w:w="2340"/>
             <w:shd w:fill="003580"/>
             <w:tcMar>
-              <w:top w:w="120" w:type="dxa"/>
-              <w:bottom w:w="120" w:type="dxa"/>
+              <w:top w:w="140" w:type="dxa"/>
+              <w:bottom w:w="140" w:type="dxa"/>
               <w:left w:w="150" w:type="dxa"/>
               <w:right w:w="150" w:type="dxa"/>
             </w:tcMar>
@@ -5112,8 +5146,8 @@
             <w:tcW w:type="dxa" w:w="2340"/>
             <w:shd w:fill="003580"/>
             <w:tcMar>
-              <w:top w:w="120" w:type="dxa"/>
-              <w:bottom w:w="120" w:type="dxa"/>
+              <w:top w:w="140" w:type="dxa"/>
+              <w:bottom w:w="140" w:type="dxa"/>
               <w:left w:w="150" w:type="dxa"/>
               <w:right w:w="150" w:type="dxa"/>
             </w:tcMar>
@@ -5138,8 +5172,8 @@
             <w:tcW w:type="dxa" w:w="2340"/>
             <w:shd w:fill="003580"/>
             <w:tcMar>
-              <w:top w:w="120" w:type="dxa"/>
-              <w:bottom w:w="120" w:type="dxa"/>
+              <w:top w:w="140" w:type="dxa"/>
+              <w:bottom w:w="140" w:type="dxa"/>
               <w:left w:w="150" w:type="dxa"/>
               <w:right w:w="150" w:type="dxa"/>
             </w:tcMar>
@@ -5164,8 +5198,8 @@
             <w:tcW w:type="dxa" w:w="2340"/>
             <w:shd w:fill="003580"/>
             <w:tcMar>
-              <w:top w:w="120" w:type="dxa"/>
-              <w:bottom w:w="120" w:type="dxa"/>
+              <w:top w:w="140" w:type="dxa"/>
+              <w:bottom w:w="140" w:type="dxa"/>
               <w:left w:w="150" w:type="dxa"/>
               <w:right w:w="150" w:type="dxa"/>
             </w:tcMar>
@@ -5869,7 +5903,7 @@
                 <w:rFonts w:ascii="Times New Roman" w:hAnsi="Times New Roman"/>
                 <w:sz w:val="20"/>
               </w:rPr>
-              <w:t>Bật/Tắt trạng thái bảo trì phòng (🟢 Sẵn sàng / 🔴 Bảo trì)</w:t>
+              <w:t>Bật/Tắt trạng thái bảo trì phòng (Sẵn sàng / Bảo trì)</w:t>
             </w:r>
           </w:p>
         </w:tc>
@@ -5908,8 +5942,8 @@
             <w:tcW w:type="dxa" w:w="1872"/>
             <w:shd w:fill="003580"/>
             <w:tcMar>
-              <w:top w:w="120" w:type="dxa"/>
-              <w:bottom w:w="120" w:type="dxa"/>
+              <w:top w:w="140" w:type="dxa"/>
+              <w:bottom w:w="140" w:type="dxa"/>
               <w:left w:w="150" w:type="dxa"/>
               <w:right w:w="150" w:type="dxa"/>
             </w:tcMar>
@@ -5934,8 +5968,8 @@
             <w:tcW w:type="dxa" w:w="1872"/>
             <w:shd w:fill="003580"/>
             <w:tcMar>
-              <w:top w:w="120" w:type="dxa"/>
-              <w:bottom w:w="120" w:type="dxa"/>
+              <w:top w:w="140" w:type="dxa"/>
+              <w:bottom w:w="140" w:type="dxa"/>
               <w:left w:w="150" w:type="dxa"/>
               <w:right w:w="150" w:type="dxa"/>
             </w:tcMar>
@@ -5960,8 +5994,8 @@
             <w:tcW w:type="dxa" w:w="1872"/>
             <w:shd w:fill="003580"/>
             <w:tcMar>
-              <w:top w:w="120" w:type="dxa"/>
-              <w:bottom w:w="120" w:type="dxa"/>
+              <w:top w:w="140" w:type="dxa"/>
+              <w:bottom w:w="140" w:type="dxa"/>
               <w:left w:w="150" w:type="dxa"/>
               <w:right w:w="150" w:type="dxa"/>
             </w:tcMar>
@@ -5986,8 +6020,8 @@
             <w:tcW w:type="dxa" w:w="1872"/>
             <w:shd w:fill="003580"/>
             <w:tcMar>
-              <w:top w:w="120" w:type="dxa"/>
-              <w:bottom w:w="120" w:type="dxa"/>
+              <w:top w:w="140" w:type="dxa"/>
+              <w:bottom w:w="140" w:type="dxa"/>
               <w:left w:w="150" w:type="dxa"/>
               <w:right w:w="150" w:type="dxa"/>
             </w:tcMar>
@@ -6012,8 +6046,8 @@
             <w:tcW w:type="dxa" w:w="1872"/>
             <w:shd w:fill="003580"/>
             <w:tcMar>
-              <w:top w:w="120" w:type="dxa"/>
-              <w:bottom w:w="120" w:type="dxa"/>
+              <w:top w:w="140" w:type="dxa"/>
+              <w:bottom w:w="140" w:type="dxa"/>
               <w:left w:w="150" w:type="dxa"/>
               <w:right w:w="150" w:type="dxa"/>
             </w:tcMar>
@@ -6134,9 +6168,11 @@
             <w:r>
               <w:rPr>
                 <w:rFonts w:ascii="Times New Roman" w:hAnsi="Times New Roman"/>
+                <w:b/>
+                <w:color w:val="166534"/>
                 <w:sz w:val="20"/>
               </w:rPr>
-              <w:t>🟢 PASS</w:t>
+              <w:t>ĐẠT</w:t>
             </w:r>
           </w:p>
         </w:tc>
@@ -6241,9 +6277,11 @@
             <w:r>
               <w:rPr>
                 <w:rFonts w:ascii="Times New Roman" w:hAnsi="Times New Roman"/>
+                <w:b/>
+                <w:color w:val="166534"/>
                 <w:sz w:val="20"/>
               </w:rPr>
-              <w:t>🟢 PASS</w:t>
+              <w:t>ĐẠT</w:t>
             </w:r>
           </w:p>
         </w:tc>
@@ -6348,9 +6386,11 @@
             <w:r>
               <w:rPr>
                 <w:rFonts w:ascii="Times New Roman" w:hAnsi="Times New Roman"/>
+                <w:b/>
+                <w:color w:val="166534"/>
                 <w:sz w:val="20"/>
               </w:rPr>
-              <w:t>🟢 PASS</w:t>
+              <w:t>ĐẠT</w:t>
             </w:r>
           </w:p>
         </w:tc>
@@ -6455,9 +6495,11 @@
             <w:r>
               <w:rPr>
                 <w:rFonts w:ascii="Times New Roman" w:hAnsi="Times New Roman"/>
+                <w:b/>
+                <w:color w:val="166534"/>
                 <w:sz w:val="20"/>
               </w:rPr>
-              <w:t>🟢 PASS</w:t>
+              <w:t>ĐẠT</w:t>
             </w:r>
           </w:p>
         </w:tc>
@@ -6522,7 +6564,7 @@
                 <w:rFonts w:ascii="Times New Roman" w:hAnsi="Times New Roman"/>
                 <w:sz w:val="20"/>
               </w:rPr>
-              <w:t>Admin bấm '➕ Đặt Phòng Tại Quầy' -&gt; Chọn phòng</w:t>
+              <w:t>Admin bấm 'Đặt Phòng Tại Quầy' -&gt; Chọn phòng</w:t>
             </w:r>
           </w:p>
         </w:tc>
@@ -6562,9 +6604,11 @@
             <w:r>
               <w:rPr>
                 <w:rFonts w:ascii="Times New Roman" w:hAnsi="Times New Roman"/>
+                <w:b/>
+                <w:color w:val="166534"/>
                 <w:sz w:val="20"/>
               </w:rPr>
-              <w:t>🟢 PASS</w:t>
+              <w:t>ĐẠT</w:t>
             </w:r>
           </w:p>
         </w:tc>
@@ -6629,7 +6673,7 @@
                 <w:rFonts w:ascii="Times New Roman" w:hAnsi="Times New Roman"/>
                 <w:sz w:val="20"/>
               </w:rPr>
-              <w:t>Admin bấm '📥 Xuất Báo Cáo CSV'</w:t>
+              <w:t>Admin bấm 'Xuất Báo Cáo CSV'</w:t>
             </w:r>
           </w:p>
         </w:tc>
@@ -6669,9 +6713,11 @@
             <w:r>
               <w:rPr>
                 <w:rFonts w:ascii="Times New Roman" w:hAnsi="Times New Roman"/>
+                <w:b/>
+                <w:color w:val="166534"/>
                 <w:sz w:val="20"/>
               </w:rPr>
-              <w:t>🟢 PASS</w:t>
+              <w:t>ĐẠT</w:t>
             </w:r>
           </w:p>
         </w:tc>

</xml_diff>